<commit_message>
Added the new tool California Sales Tax Calculator.
</commit_message>
<xml_diff>
--- a/Documentation/AboutTaxTools.docx
+++ b/Documentation/AboutTaxTools.docx
@@ -47,7 +47,7 @@
         <w:rPr>
           <w:noProof/>
         </w:rPr>
-        <w:t>May 2, 2026</w:t>
+        <w:t>May 16, 2026</w:t>
       </w:r>
       <w:r>
         <w:rPr>
@@ -496,6 +496,14 @@
         <w:pStyle w:val="List-Bullet-tight025"/>
       </w:pPr>
       <w:r>
+        <w:t>California Sales Tax Calculator</w:t>
+      </w:r>
+    </w:p>
+    <w:p>
+      <w:pPr>
+        <w:pStyle w:val="List-Bullet-tight025"/>
+      </w:pPr>
+      <w:r>
         <w:t>Enhanced Deduction for Seniors Calculator</w:t>
       </w:r>
     </w:p>
@@ -604,38 +612,32 @@
         <w:pStyle w:val="Body-Text"/>
       </w:pPr>
       <w:r>
-        <w:t>Each tool contains a brief description describing its purpose and how to use it. The more complicated tools will have a link to a separate page with more detailed information about the tool.</w:t>
-      </w:r>
+        <w:t xml:space="preserve">Each tool contains a brief description </w:t>
+      </w:r>
+      <w:r>
+        <w:t>of</w:t>
+      </w:r>
+      <w:r>
+        <w:t xml:space="preserve"> its purpose and how to use it. The more complicated tools have a link to a separate page with more detailed information about the tool.</w:t>
+      </w:r>
+    </w:p>
+    <w:p>
+      <w:pPr>
+        <w:pStyle w:val="Heading2"/>
+      </w:pPr>
+      <w:bookmarkStart w:id="1" w:name="_Toc228630160"/>
+      <w:r>
+        <w:t>Interface</w:t>
+      </w:r>
+      <w:bookmarkEnd w:id="1"/>
     </w:p>
     <w:p>
       <w:pPr>
         <w:pStyle w:val="Body-Text"/>
       </w:pPr>
       <w:r>
-        <w:t xml:space="preserve">There is a lot of shared code between the tools, which gives them a similar </w:t>
-      </w:r>
-      <w:r>
-        <w:t xml:space="preserve">appearance and </w:t>
-      </w:r>
-      <w:r>
-        <w:t>behavior</w:t>
-      </w:r>
-      <w:r>
-        <w:t>. For example, green fields are for input in all the tools, and blue fields display the values that are calculated by the tools.</w:t>
-      </w:r>
-      <w:r>
-        <w:t xml:space="preserve"> The tools are intended to be used in a browser. The display of each tool is restricted to 7.5 inches to make it easier to print the pages.</w:t>
-      </w:r>
-    </w:p>
-    <w:p>
-      <w:pPr>
-        <w:pStyle w:val="Heading2"/>
-      </w:pPr>
-      <w:bookmarkStart w:id="1" w:name="_Toc228630160"/>
-      <w:r>
-        <w:t>Interface</w:t>
-      </w:r>
-      <w:bookmarkEnd w:id="1"/>
+        <w:t>There is a lot of shared code between the tools, which gives them a similar appearance and behavior. For example, green fields are for input in all the tools, and blue fields display the values that are calculated by the tools. The tools are intended to be used in a browser. The display of each tool is restricted to 7.5 inches to make it easier to print the pages.</w:t>
+      </w:r>
     </w:p>
     <w:p>
       <w:pPr>
@@ -653,7 +655,10 @@
         <w:pStyle w:val="Body-Text"/>
       </w:pPr>
       <w:r>
-        <w:t>Many of the tools provide tooltips. These are small popup displays that show up when you move the mouse over one of the fields. They provide a short explanation of the purpose of the fields. When available, tooltips are provided for both input fields to help you enter the correct information, and for output fields to explain what the information means.</w:t>
+        <w:t>Most</w:t>
+      </w:r>
+      <w:r>
+        <w:t xml:space="preserve"> of the tools provide tooltips. These are small popup displays that show up when you move the mouse over one of the fields. They provide a short explanation of the purpose of the fields. When available, tooltips are provided for both input fields to help you enter the correct information, and for output fields to explain what the information means.</w:t>
       </w:r>
     </w:p>
     <w:p>
@@ -672,15 +677,19 @@
         <w:pStyle w:val="Body-Text"/>
       </w:pPr>
       <w:r>
-        <w:t xml:space="preserve">For any input field where a numeric value is expected, dollar </w:t>
-      </w:r>
-      <w:proofErr w:type="gramStart"/>
-      <w:r>
-        <w:t>signs(</w:t>
-      </w:r>
-      <w:proofErr w:type="gramEnd"/>
-      <w:r>
-        <w:t xml:space="preserve">$) and commas(,) are ignored. This allows you to enter a number as, for example, "$40,000", "$40000", or "40000". In addition, numeric fields can contain simple arithmetic expressions. For example, you can enter "($40,000 + 4,000) * 0.075" to enter 7.5% of 44000. All numeric input will be rounded to the nearest whole number. The expression evaluator supports the following </w:t>
+        <w:t>For any input field where a numeric value is expected, dollar signs</w:t>
+      </w:r>
+      <w:r>
+        <w:t xml:space="preserve"> </w:t>
+      </w:r>
+      <w:r>
+        <w:t>($) and commas</w:t>
+      </w:r>
+      <w:r>
+        <w:t xml:space="preserve"> </w:t>
+      </w:r>
+      <w:r>
+        <w:t xml:space="preserve">(,) are ignored. This allows you to enter a number as, for example, "$40,000", "$40000", or "40000". In addition, numeric fields can contain simple arithmetic expressions. For example, you can enter "($40,000 + 4,000) * 0.075" to enter 7.5% of 44000. All numeric input will be rounded to the nearest whole number. The expression evaluator supports the following </w:t>
       </w:r>
       <w:r>
         <w:t>operators</w:t>
@@ -1094,6 +1103,14 @@
       </w:r>
       <w:r>
         <w:t>not ready to be used.</w:t>
+      </w:r>
+    </w:p>
+    <w:p>
+      <w:pPr>
+        <w:pStyle w:val="Body-Text"/>
+      </w:pPr>
+      <w:r>
+        <w:t>Whenever the version number is shown in one of the tools, it is a link that you can click to show the version history information.</w:t>
       </w:r>
     </w:p>
     <w:p>
@@ -4796,7 +4813,7 @@
 </file>
 
 <file path=customXml/itemProps1.xml><?xml version="1.0" encoding="utf-8"?>
-<ds:datastoreItem xmlns:ds="http://schemas.openxmlformats.org/officeDocument/2006/customXml" ds:itemID="{99C825F0-D6A4-4B52-BC93-F403CFFAF1EA}">
+<ds:datastoreItem xmlns:ds="http://schemas.openxmlformats.org/officeDocument/2006/customXml" ds:itemID="{6FD93924-F09C-42A3-B224-82DF46818737}">
   <ds:schemaRefs>
     <ds:schemaRef ds:uri="http://schemas.openxmlformats.org/officeDocument/2006/bibliography"/>
   </ds:schemaRefs>

</xml_diff>

<commit_message>
Rename TaxTools to Tax Planning Tools in documentation.
</commit_message>
<xml_diff>
--- a/Documentation/AboutTaxTools.docx
+++ b/Documentation/AboutTaxTools.docx
@@ -53,7 +53,19 @@
         <w:pStyle w:val="Title"/>
       </w:pPr>
       <w:r>
-        <w:t>About TaxTools</w:t>
+        <w:t xml:space="preserve">About </w:t>
+      </w:r>
+      <w:r>
+        <w:t xml:space="preserve">the </w:t>
+      </w:r>
+      <w:r>
+        <w:t>Tax</w:t>
+      </w:r>
+      <w:r>
+        <w:t xml:space="preserve"> Planning </w:t>
+      </w:r>
+      <w:r>
+        <w:t>Tools</w:t>
       </w:r>
     </w:p>
     <w:p>
@@ -61,7 +73,10 @@
         <w:pStyle w:val="Body-Text"/>
       </w:pPr>
       <w:r>
-        <w:t>TaxTools is a collection of web-based tools for calculating income tax information. The current set of tools is:</w:t>
+        <w:t>The Tax Planning Tools are</w:t>
+      </w:r>
+      <w:r>
+        <w:t xml:space="preserve"> a collection of web-based tools for calculating income tax information. The current set of tools is:</w:t>
       </w:r>
     </w:p>
     <w:p>
@@ -181,7 +196,13 @@
         <w:pStyle w:val="Body-Text"/>
       </w:pPr>
       <w:r>
-        <w:t>You can access the latest version of tools on the web using the following URL.</w:t>
+        <w:t xml:space="preserve">You can access the latest version of </w:t>
+      </w:r>
+      <w:r>
+        <w:t xml:space="preserve">the </w:t>
+      </w:r>
+      <w:r>
+        <w:t>tools on the web using the following URL.</w:t>
       </w:r>
     </w:p>
     <w:p>
@@ -388,11 +409,11 @@
         <w:t xml:space="preserve"> </w:t>
       </w:r>
       <w:r>
-        <w:t xml:space="preserve">(,) are ignored. This allows you to enter a number as, for example, "$40,000", "$40000", or "40000". In addition, numeric fields can contain simple arithmetic expressions. For example, you can enter "($40,000 + 4,000) * 0.075" to enter </w:t>
+        <w:t xml:space="preserve">(,) are ignored. This allows you to enter a number as, for example, "$40,000", "$40000", or "40000". In addition, numeric fields </w:t>
       </w:r>
       <w:r>
         <w:lastRenderedPageBreak/>
-        <w:t xml:space="preserve">7.5% of 44000. All numeric input will be rounded to the nearest whole number. The expression evaluator supports the following </w:t>
+        <w:t xml:space="preserve">can contain simple arithmetic expressions. For example, you can enter "($40,000 + 4,000) * 0.075" to enter 7.5% of 44000. All numeric input will be rounded to the nearest whole number. The expression evaluator supports the following </w:t>
       </w:r>
       <w:r>
         <w:t>operators</w:t>
@@ -535,7 +556,13 @@
         <w:pStyle w:val="Body-Text"/>
       </w:pPr>
       <w:r>
-        <w:t xml:space="preserve">There is a single version number for all of the tax tools because there so much shared code between the tools. </w:t>
+        <w:t xml:space="preserve">There is a single version number for all of the tax </w:t>
+      </w:r>
+      <w:r>
+        <w:t xml:space="preserve">planning </w:t>
+      </w:r>
+      <w:r>
+        <w:t xml:space="preserve">tools because there so much shared code between the tools. </w:t>
       </w:r>
       <w:r>
         <w:t>The version number is a 3-part number</w:t>
@@ -553,12 +580,18 @@
         <w:t xml:space="preserve">present in released versions of </w:t>
       </w:r>
       <w:r>
+        <w:t xml:space="preserve">the </w:t>
+      </w:r>
+      <w:r>
         <w:t>T</w:t>
       </w:r>
       <w:r>
         <w:t>ax</w:t>
       </w:r>
       <w:r>
+        <w:t xml:space="preserve"> Planning </w:t>
+      </w:r>
+      <w:r>
         <w:t>T</w:t>
       </w:r>
       <w:r>
@@ -596,7 +629,19 @@
         <w:pStyle w:val="Body-Text"/>
       </w:pPr>
       <w:r>
-        <w:t xml:space="preserve">The second part of the version number is the incremented each time a new version of TaxTools is released. There are always two versions of TaxTools: the released version and a </w:t>
+        <w:t xml:space="preserve">The second part of the version number is the incremented each time a new version of </w:t>
+      </w:r>
+      <w:r>
+        <w:t>the Tax Planning Tools</w:t>
+      </w:r>
+      <w:r>
+        <w:t xml:space="preserve"> is released. There are always two versions of </w:t>
+      </w:r>
+      <w:r>
+        <w:t>t</w:t>
+      </w:r>
+      <w:r>
+        <w:t xml:space="preserve">ools: the released version and a </w:t>
       </w:r>
       <w:r>
         <w:t>development</w:t>
@@ -616,7 +661,10 @@
         <w:t>rarely</w:t>
       </w:r>
       <w:r>
-        <w:t xml:space="preserve"> used in the released version of TaxTools</w:t>
+        <w:t xml:space="preserve"> used in the released version of </w:t>
+      </w:r>
+      <w:r>
+        <w:t>the Tax Planning Tools</w:t>
       </w:r>
       <w:r>
         <w:t>.</w:t>
@@ -750,6 +798,7 @@
         <w:pStyle w:val="List-Bullet-tight050"/>
       </w:pPr>
       <w:r>
+        <w:lastRenderedPageBreak/>
         <w:t xml:space="preserve">CTC, EIC, and </w:t>
       </w:r>
       <w:proofErr w:type="spellStart"/>
@@ -766,7 +815,6 @@
         <w:pStyle w:val="List-Bullet-tight050"/>
       </w:pPr>
       <w:r>
-        <w:lastRenderedPageBreak/>
         <w:t>Foreign Tax Credit Calculator</w:t>
       </w:r>
     </w:p>
@@ -815,11 +863,9 @@
       <w:r>
         <w:t xml:space="preserve">Should the tools be implemented as Excel </w:t>
       </w:r>
-      <w:proofErr w:type="gramStart"/>
-      <w:r>
-        <w:t>spreadsheets.</w:t>
-      </w:r>
-      <w:proofErr w:type="gramEnd"/>
+      <w:r>
+        <w:t>spreadsheets?</w:t>
+      </w:r>
       <w:r>
         <w:t xml:space="preserve"> It would allow the user to see the actual computations that are being made. Users could review the formulas for accuracy and provide feedback. They could also make changes to their copy of the spreadsheet to prototype new ideas. However, since each spreadsheet contains all the code that it uses, once it is copied, it would be difficult to know how it differs from another version. It would be impossible to update all the copies when a change needs to be made. Version control could be a nightmare.</w:t>
       </w:r>
@@ -844,16 +890,10 @@
         <w:t xml:space="preserve">If you have any feedback on </w:t>
       </w:r>
       <w:r>
-        <w:t>T</w:t>
-      </w:r>
-      <w:r>
-        <w:t>ax</w:t>
-      </w:r>
-      <w:r>
-        <w:t>T</w:t>
-      </w:r>
-      <w:r>
-        <w:t>ools, send it to bruce_blinn@yahoo.com. I would welcome any information about problems with the tools or suggestion on how to improve them.</w:t>
+        <w:t>the Tax Planning Tools</w:t>
+      </w:r>
+      <w:r>
+        <w:t>, send it to bruce_blinn@yahoo.com. I would welcome any information about problems with the tools or suggestion on how to improve them.</w:t>
       </w:r>
     </w:p>
     <w:sectPr>
@@ -978,7 +1018,7 @@
         <w:szCs w:val="24"/>
         <w:lang w:eastAsia="en-US"/>
       </w:rPr>
-      <w:t>1</w:t>
+      <w:t>3</w:t>
     </w:r>
     <w:r>
       <w:rPr>
@@ -3090,7 +3130,7 @@
 </file>
 
 <file path=customXml/itemProps1.xml><?xml version="1.0" encoding="utf-8"?>
-<ds:datastoreItem xmlns:ds="http://schemas.openxmlformats.org/officeDocument/2006/customXml" ds:itemID="{FFDA602B-4FF4-4880-BCFE-D42603974D4B}">
+<ds:datastoreItem xmlns:ds="http://schemas.openxmlformats.org/officeDocument/2006/customXml" ds:itemID="{3ED69458-DFA1-4813-9EF5-0162E75A5D9D}">
   <ds:schemaRefs>
     <ds:schemaRef ds:uri="http://schemas.openxmlformats.org/officeDocument/2006/bibliography"/>
   </ds:schemaRefs>

</xml_diff>